<commit_message>
feat: desktop instance launcher, transactional updates and beta naming
</commit_message>
<xml_diff>
--- a/docs/PRD.docx
+++ b/docs/PRD.docx
@@ -11,7 +11,7 @@
           <w:color w:val="9E7D40"/>
           <w:sz w:val="20"/>
         </w:rPr>
-        <w:t>PRODUCT REQUIREMENTS  /  V2.0</w:t>
+        <w:t>PRODUCT REQUIREMENTS  /  2.1.0-beta.1 测试版</w:t>
       </w:r>
     </w:p>
     <w:p>
@@ -138,7 +138,7 @@
     </w:p>
     <w:p>
       <w:r>
-        <w:t>版本：2.0.0 · 日期：2026-09-30 · 插件 API：1</w:t>
+        <w:t>版本：2.1.0-beta.1 · 日期：2026-09-30 · 插件 API：1</w:t>
       </w:r>
     </w:p>
     <w:p>
@@ -147,7 +147,7 @@
         <w:ind w:left="170" w:right="113"/>
       </w:pPr>
       <w:r>
-        <w:t>从可运行的 V1 升级，不是重画静态原型。V1 账号、房间、权限、通用轻规则、双模型适配、事件与回档保留；新增小宿主、独立开关模块、方格场景、实时图标、台本、双模式 TTS 和可发布 GitHub 插件 SDK。真实模型／TTS 密钥尚未提供；项目仓库为 https://github.com/Tera-Dark/Ember-Tavern，当前为朋友测试版。</w:t>
+        <w:t>从可运行的 V1 升级，不是重画静态原型。V1 账号、房间、权限、通用轻规则、双模型适配、事件与回档保留；新增小宿主、独立开关模块、方格场景、实时图标、台本、双模式 TTS 和可发布 GitHub 插件 SDK。真实模型／TTS 密钥尚未提供；项目仓库为 https://github.com/Tera-Dark/Ember-Tavern，当前为测试版。</w:t>
       </w:r>
     </w:p>
     <w:p>
@@ -1998,6 +1998,34 @@
         <w:t>。</w:t>
       </w:r>
     </w:p>
+    <w:p>
+      <w:pPr>
+        <w:pStyle w:val="Heading1"/>
+      </w:pPr>
+      <w:r>
+        <w:t>13. 桌面实例启动器</w:t>
+      </w:r>
+    </w:p>
+    <w:p>
+      <w:r>
+        <w:t>启动器版本 0.1.0-beta.1。Windows x64，Go + WebView2，管理实例而非耦合跑团业务；按用户提供的集中式启动器设计理念实现深色首页、搜索、实例卡片与任务入口。</w:t>
+      </w:r>
+    </w:p>
+    <w:p>
+      <w:r>
+        <w:t>首次自动准备 Python / pip 环境、固定 GitHub 源码、依赖与健康检查，正常使用无需手动安装 Git / Node。更新备份、数据副本预检、版本化依赖与原地目录替换；事务 journal 与自动恢复。设置只保存于本机，不回显密钥。</w:t>
+      </w:r>
+    </w:p>
+    <w:p>
+      <w:r>
+        <w:t>默认管理接口仅本机，游戏端口可选择可信局域网；实例独立数据与进程，不能把不同实例邀请码混用。</w:t>
+      </w:r>
+    </w:p>
+    <w:p>
+      <w:r>
+        <w:t>本轮已构建 Windows EXE；Linux 集成与浏览器验收通过，不等于 Windows WebView2 / Installer / SmartScreen 已实机通过。见 docs/LAUNCHER_TEST_REPORT.md。</w:t>
+      </w:r>
+    </w:p>
     <w:sectPr>
       <w:headerReference w:type="default" r:id="rId9"/>
       <w:footerReference w:type="default" r:id="rId10"/>
@@ -2048,7 +2076,7 @@
       <w:rPr>
         <w:sz w:val="16"/>
       </w:rPr>
-      <w:t xml:space="preserve">                                       产品需求文档 · V2.0</w:t>
+      <w:t xml:space="preserve">                                       产品需求文档 · 2.1.0-beta.1 测试版</w:t>
     </w:r>
   </w:p>
 </w:hdr>

</xml_diff>